<commit_message>
Master document v3: Salvage Managers is the one CoCo TradeSphereX; General Marketplace is the combined view, not a Tenant (D-130)
Co-Authored-By: Claude Opus 5.5 <noreply@anthropic.com>
Claude-Session: https://claude.ai/code/session_01FpdzLt3rHj1WHFMb7vzaqz
</commit_message>
<xml_diff>
--- a/docs/source-documents/ADWITIX_Master.docx
+++ b/docs/source-documents/ADWITIX_Master.docx
@@ -59,7 +59,7 @@
           <w:sz w:val="22"/>
           <w:szCs w:val="22"/>
         </w:rPr>
-        <w:t xml:space="preserve">Status: Master file, v2. Fully reconciled — supersedes all prior governance drafts, the separately-issued Consolidated Specification, and all standalone Business Model documents (v1.2 through v1.6, now merged into Section 6). This revision resolves six contradictions identified between the original platform rules (Sections 2–3) and the finalized Business Model (Section 6): BR-08, BR-09, BR-31 through BR-34, BR-56, BR-67, BR-12, and PR-06/PR-32 have been rewritten so the Success Fee schedule and Fee Payer Election in Section 6.4 are the single source of truth on pricing and settlement.</w:t>
+        <w:t xml:space="preserve">Status: Master file, v3 (22 Oct 2026, D-130: Salvage Managers is the one CoCo TradeSphereX and is not on the subscription ladder — BR-12, BR-31 to BR-33, BR-66, Sections 6.2, 6.5 and 6.10 and the glossary updated; the General Marketplace is the combined view of all TSXs, not a Tenant). v2: Fully reconciled — supersedes all prior governance drafts, the separately-issued Consolidated Specification, and all standalone Business Model documents (v1.2 through v1.6, now merged into Section 6). This revision resolves six contradictions identified between the original platform rules (Sections 2–3) and the finalized Business Model (Section 6): BR-08, BR-09, BR-31 through BR-34, BR-56, BR-67, BR-12, and PR-06/PR-32 have been rewritten so the Success Fee schedule and Fee Payer Election in Section 6.4 are the single source of truth on pricing and settlement.</w:t>
       </w:r>
     </w:p>
     <w:p>
@@ -1411,7 +1411,7 @@
         <w:t xml:space="preserve">Subscription Tier — </w:t>
       </w:r>
       <w:r>
-        <w:t xml:space="preserve">The package level a Tenant operates under — CoCo Starter (free), TSX Launch, TSX Growth, or TSX Enterprise — which determines things like API access and whether Seller-Pays is available. </w:t>
+        <w:t xml:space="preserve">The package level a Tenant operates under — TSX Launch, TSX Growth or TSX Enterprise — which determines things like API access and whether Seller-Pays is available. The platform's own Salvage Managers TSX sits outside this ladder on the CoCo plan. </w:t>
       </w:r>
       <w:r>
         <w:rPr>
@@ -1457,7 +1457,7 @@
         <w:t xml:space="preserve">Tenant / Shop — </w:t>
       </w:r>
       <w:r>
-        <w:t xml:space="preserve">An individual storefront operating on AdwitiX under its own branding — could be a bank, an institution, or the platform's own general marketplace. </w:t>
+        <w:t xml:space="preserve">An individual storefront operating on AdwitiX under its own branding — could be a bank, an institution, a company, or the platform's own Salvage Managers. The General Marketplace is not a Tenant: it is the combined view of the Lots of every TSX; choosing a TSX from its dropdown opens that TSX's own whitelisted page. </w:t>
       </w:r>
       <w:r>
         <w:rPr>
@@ -2250,7 +2250,7 @@
         <w:t xml:space="preserve">Statement: </w:t>
       </w:r>
       <w:r>
-        <w:t xml:space="preserve">The platform supports four sale systems: (1) Buy-Now — seller sets an Expected Value (EV); buyers offer at, above, or below it; seller reviews and selects by judgment, not automatic highest-price close. (2) Express Auctions — seller sets a Reserve Value (RV); once exactly 3 distinct buyers pledge EMD, the auction is scheduled and launched automatically; no inspection window exists at all; result is fully automatic. (3) Easy Auctions — scheduled open bidding at RV; result may be Instant Close or Approval Required (seller's choice at listing). (4) Tender Auctions — fully bespoke, invitation-only, seller-curated, restricted exclusively to the Company Shop. The Company Shop is the Salvage Managers Tenant specifically — the platform's own operational entity, not a generic label any Tenant can hold. Where Section 6 refers to “the Salvage Managers TSX,” this is the same designation.</w:t>
+        <w:t xml:space="preserve">The platform supports four sale systems: (1) Buy-Now — seller sets an Expected Value (EV); buyers offer at, above, or below it; seller reviews and selects by judgment, not automatic highest-price close. (2) Express Auctions — seller sets a Reserve Value (RV); once exactly 3 distinct buyers pledge EMD, the auction is scheduled and launched automatically; no inspection window exists at all; result is fully automatic. (3) Easy Auctions — scheduled open bidding at RV; result may be Instant Close or Approval Required (seller's choice at listing). (4) Tender Auctions — fully bespoke, invitation-only, seller-curated, restricted exclusively to the Company Shop. The Company Shop is the Salvage Managers Tenant specifically — the platform's own operational entity, not a generic label any Tenant can hold. Where Section 6 refers to “the Salvage Managers TSX,” this is the same designation. There is exactly one Salvage Managers TSX. It alone holds the CoCo plan and the Company Shop class, and the two always go together: the Custodian cannot whitelist a second CoCo or Company Shop TSX, move another TSX onto CoCo, or give the Company Shop class to any other TSX. Salvage Managers is listed first wherever TradeSphereX are listed.</w:t>
       </w:r>
     </w:p>
     <w:p>
@@ -3352,7 +3352,7 @@
         <w:t xml:space="preserve">Statement: </w:t>
       </w:r>
       <w:r>
-        <w:t>The Success Fee is a single, platform-wide, non-tenant-adjustable schedule, declining by final sale value from 2.00% down to 0.50% (minimum ₹500 + GST), fully specified in Section 6.4. It replaces the earlier flat-0.5%-SaaS-plus-tenant-adjustable-0.5%-5%-band model. It applies uniformly to Buy-Now, Express, and Easy Auctions; Tender Auctions remain excluded and follow the CoCo Concierge terms instead (Section 6.2). By default the Trader (buyer) pays the Success Fee, so listing and selling remain free for the Market Maker (seller) exactly as before. A Market Maker on a paid TSX subscription tier (TSX Launch, TSX Growth, or TSX Enterprise — Section 6.4) may instead elect Seller-Pays per Trading Session (Fee Payer Election, BR-32) to absorb the fee itself, matching a 0%-visible-premium competitor; this is a deliberate exception the Market Maker chooses, not a change to the default. A CoCo Starter TSX has no such billing relationship with ADWITIX (Section 6.4, BR-33) and only ever runs Buyer-Pays.</w:t>
+        <w:t>The Success Fee is a single, platform-wide, non-tenant-adjustable schedule, declining by final sale value from 2.00% down to 0.50% (minimum ₹500 + GST), fully specified in Section 6.4. It replaces the earlier flat-0.5%-SaaS-plus-tenant-adjustable-0.5%-5%-band model. It applies uniformly to Buy-Now, Express, and Easy Auctions; Tender Auctions remain excluded and follow the CoCo Concierge terms instead (Section 6.2). By default the Trader (buyer) pays the Success Fee, so listing and selling remain free for the Market Maker (seller) exactly as before. A Market Maker on a paid TSX subscription tier (TSX Launch, TSX Growth, or TSX Enterprise — Section 6.4) may instead elect Seller-Pays per Trading Session (Fee Payer Election, BR-32) to absorb the fee itself, matching a 0%-visible-premium competitor; this is a deliberate exception the Market Maker chooses, not a change to the default. The Salvage Managers TSX has no such billing relationship with ADWITIX (Section 6.4, BR-33) and only ever runs Buyer-Pays.</w:t>
       </w:r>
     </w:p>
     <w:p>
@@ -3410,7 +3410,7 @@
         <w:t xml:space="preserve">Statement: </w:t>
       </w:r>
       <w:r>
-        <w:t xml:space="preserve">Each Trading Session carries a Fee Payer Election, set by the Market Maker before the session opens and locked once bidding is live: Buyer-Pays (default) or Seller-Pays. Under Buyer-Pays, the Success Fee (BR-31) is calculated, locked, and deducted directly from the buyer's escrowed EMD at settlement, as before. Under Seller-Pays, the buyer's EMD is settled and released in full; because the platform never touches the seller's 100% sale-value proceeds (BR-33 — payment passes directly and offline, buyer to seller), the Success Fee cannot be deducted from those proceeds at settlement the way Buyer-Pays deducts from escrowed EMD. Instead, the fee is recorded against the TSX and consolidated into one GST-compliant invoice per TSX per calendar month, which the TSX Master settles directly with ADWITIX. Seller-Pays is therefore available only on a paid TSX subscription tier (TSX Launch, TSX Growth, TSX Enterprise — Section 6.4); a CoCo Starter TSX has no such billing relationship and only ever runs Buyer-Pays. The fee amount and the platform's revenue are identical either way — only who it is billed to, and how, changes. The Tenant Admin no longer adjusts the fee rate itself, which is fixed platform-wide (BR-31).</w:t>
+        <w:t xml:space="preserve">Each Trading Session carries a Fee Payer Election, set by the Market Maker before the session opens and locked once bidding is live: Buyer-Pays (default) or Seller-Pays. Under Buyer-Pays, the Success Fee (BR-31) is calculated, locked, and deducted directly from the buyer's escrowed EMD at settlement, as before. Under Seller-Pays, the buyer's EMD is settled and released in full; because the platform never touches the seller's 100% sale-value proceeds (BR-33 — payment passes directly and offline, buyer to seller), the Success Fee cannot be deducted from those proceeds at settlement the way Buyer-Pays deducts from escrowed EMD. Instead, the fee is recorded against the TSX and consolidated into one GST-compliant invoice per TSX per calendar month, which the TSX Master settles directly with ADWITIX. Seller-Pays is therefore available only on a paid TSX subscription tier (TSX Launch, TSX Growth, TSX Enterprise — Section 6.4); the Salvage Managers TSX has no such billing relationship and only ever runs Buyer-Pays. The fee amount and the platform's revenue are identical either way — only who it is billed to, and how, changes. The Tenant Admin no longer adjusts the fee rate itself, which is fixed platform-wide (BR-31).</w:t>
       </w:r>
     </w:p>
     <w:p>
@@ -6436,7 +6436,7 @@
         <w:t xml:space="preserve">Statement: </w:t>
       </w:r>
       <w:r>
-        <w:t xml:space="preserve">API's ongoing use carries no separate per-call or per-endpoint metered fee. API availability itself is a package feature that varies by TSX tier, per the platform's Business Model (Section 6): CoCo Starter has no API access; TSX Launch has read-only (status/reporting) access; TSX Growth adds the ability to push Lots (read + push listings, no Sale System push); TSX Enterprise has full push/pull access. A one-time API Integration Setup service fee (Section 6, Optional Marketplace Services) may apply to help a Tenant's own systems connect, distinct from ongoing API access itself.</w:t>
+        <w:t xml:space="preserve">API's ongoing use carries no separate per-call or per-endpoint metered fee. API availability itself is a package feature that varies by TSX tier, per the platform's Business Model (Section 6): Salvage Managers has no API access (it is run directly through the Custodian Console); TSX Launch has read-only (status/reporting) access; TSX Growth adds the ability to push Lots (read + push listings, no Sale System push); TSX Enterprise has full push/pull access. A one-time API Integration Setup service fee (Section 6, Optional Marketplace Services) may apply to help a Tenant's own systems connect, distinct from ongoing API access itself.</w:t>
       </w:r>
     </w:p>
     <w:p>
@@ -15042,10 +15042,10 @@
         <w:rPr>
           <w:b/>
         </w:rPr>
-        <w:t xml:space="preserve">CoCo Starter (Free): </w:t>
-      </w:r>
-      <w:r>
-        <w:t xml:space="preserve">For individual sellers and one-time sellers. Free registration; unlimited Lots, Trading Sessions, Market Makers and Traders; standard auction engine; all three automated Sale Systems (Buy Now, Express, Easy Auction). The Success Fee (5.3) applies to every completed sale — free to join, not free to transact.</w:t>
+        <w:t xml:space="preserve">Salvage Managers (CoCo): </w:t>
+      </w:r>
+      <w:r>
+        <w:t xml:space="preserve">The platform's own TradeSphereX — not a plan any other Tenant can buy. Individual and one-time Market Makers sell here free of any subscription: unlimited Lots, Trading Sessions, Market Makers and Traders; all three automated Sale Systems (Buy-Now, Express, Easy Auction); and Tender Auctions through CoCo Concierge (below). The Success Fee (6.4) applies to every completed sale — free to join, not free to transact.</w:t>
       </w:r>
     </w:p>
     <w:p>
@@ -16124,7 +16124,7 @@
         <w:t xml:space="preserve">Fee Payer Election: </w:t>
       </w:r>
       <w:r>
-        <w:t xml:space="preserve">The Success Fee rate itself never changes. What is configurable, per Trading Session, is who pays it — Buyer-Pays (default: Trader's total = Trade Value + Success Fee + GST) or Seller-Pays (Trader pays only the Trade Value, a 0% visible premium). Because the platform never touches the Market Maker's 100% sale-value proceeds (BR-33 — payment passes directly and offline, Trader to Market Maker), a Seller-Pays fee cannot be deducted from those proceeds in real time; instead it is recorded against the Trading Session's TSX and consolidated into one GST-compliant invoice per TSX per calendar month, which the TSX Master settles directly with ADWITIX — a genuine ongoing billing relationship a CoCo Starter TSX does not have. Seller-Pays is therefore available on every paid tier (TSX Launch, TSX Growth, TSX Enterprise); a CoCo Starter TSX only ever runs Buyer-Pays. Must be locked before a Trading Session opens and cannot change once bidding is live. The platform's Success Fee revenue is identical either way — only who it is billed to changes, letting a Market Maker on a paid tier match a 0%-buyer-premium competitor (e.g. BAANKNET) without the platform discounting its own take.</w:t>
+        <w:t xml:space="preserve">The Success Fee rate itself never changes. What is configurable, per Trading Session, is who pays it — Buyer-Pays (default: Trader's total = Trade Value + Success Fee + GST) or Seller-Pays (Trader pays only the Trade Value, a 0% visible premium). Because the platform never touches the Market Maker's 100% sale-value proceeds (BR-33 — payment passes directly and offline, Trader to Market Maker), a Seller-Pays fee cannot be deducted from those proceeds in real time; instead it is recorded against the Trading Session's TSX and consolidated into one GST-compliant invoice per TSX per calendar month, which the TSX Master settles directly with ADWITIX — a genuine ongoing billing relationship the Salvage Managers TSX does not have. Seller-Pays is therefore available on every paid tier (TSX Launch, TSX Growth, TSX Enterprise); the Salvage Managers TSX only ever runs Buyer-Pays. Must be locked before a Trading Session opens and cannot change once bidding is live. The platform's Success Fee revenue is identical either way — only who it is billed to changes, letting a Market Maker on a paid tier match a 0%-buyer-premium competitor (e.g. BAANKNET) without the platform discounting its own take.</w:t>
       </w:r>
     </w:p>
     <w:p/>
@@ -16208,7 +16208,7 @@
                 <w:b/>
                 <w:bCs/>
               </w:rPr>
-              <w:t xml:space="preserve">CoCo Starter</w:t>
+              <w:t xml:space="preserve">Salvage Managers</w:t>
             </w:r>
           </w:p>
         </w:tc>
@@ -16322,7 +16322,7 @@
             </w:pPr>
             <w:r>
               <w:rPr/>
-              <w:t xml:space="preserve">5 GB</w:t>
+              <w:t xml:space="preserve">1 TB</w:t>
             </w:r>
           </w:p>
         </w:tc>
@@ -16424,7 +16424,7 @@
             </w:pPr>
             <w:r>
               <w:rPr/>
-              <w:t xml:space="preserve">25 MB</w:t>
+              <w:t xml:space="preserve">500 MB</w:t>
             </w:r>
           </w:p>
         </w:tc>
@@ -16526,7 +16526,7 @@
             </w:pPr>
             <w:r>
               <w:rPr/>
-              <w:t xml:space="preserve">20</w:t>
+              <w:t xml:space="preserve">Unlimited</w:t>
             </w:r>
           </w:p>
         </w:tc>
@@ -16628,7 +16628,7 @@
             </w:pPr>
             <w:r>
               <w:rPr/>
-              <w:t xml:space="preserve">1</w:t>
+              <w:t xml:space="preserve">Unlimited</w:t>
             </w:r>
           </w:p>
         </w:tc>
@@ -16730,7 +16730,7 @@
             </w:pPr>
             <w:r>
               <w:rPr/>
-              <w:t xml:space="preserve">10</w:t>
+              <w:t xml:space="preserve">Unlimited</w:t>
             </w:r>
           </w:p>
         </w:tc>
@@ -16832,7 +16832,7 @@
             </w:pPr>
             <w:r>
               <w:rPr/>
-              <w:t xml:space="preserve">1 Year</w:t>
+              <w:t xml:space="preserve">10 Years</w:t>
             </w:r>
           </w:p>
         </w:tc>
@@ -16934,7 +16934,7 @@
             </w:pPr>
             <w:r>
               <w:rPr/>
-              <w:t xml:space="preserve">30 Days</w:t>
+              <w:t xml:space="preserve">1 Year</w:t>
             </w:r>
           </w:p>
         </w:tc>
@@ -17036,7 +17036,7 @@
             </w:pPr>
             <w:r>
               <w:rPr/>
-              <w:t xml:space="preserve">7 Days</w:t>
+              <w:t xml:space="preserve">180 Days</w:t>
             </w:r>
           </w:p>
         </w:tc>
@@ -17138,7 +17138,7 @@
             </w:pPr>
             <w:r>
               <w:rPr/>
-              <w:t xml:space="preserve">—</w:t>
+              <w:t xml:space="preserve">Yes</w:t>
             </w:r>
           </w:p>
         </w:tc>
@@ -17240,7 +17240,7 @@
             </w:pPr>
             <w:r>
               <w:rPr/>
-              <w:t xml:space="preserve">Automatic</w:t>
+              <w:t xml:space="preserve">Custodian-defined</w:t>
             </w:r>
           </w:p>
         </w:tc>
@@ -17444,7 +17444,7 @@
             </w:pPr>
             <w:r>
               <w:rPr/>
-              <w:t xml:space="preserve">Chargeable</w:t>
+              <w:t xml:space="preserve">Included</w:t>
             </w:r>
           </w:p>
         </w:tc>
@@ -17546,7 +17546,7 @@
             </w:pPr>
             <w:r>
               <w:rPr/>
-              <w:t xml:space="preserve">90 Days</w:t>
+              <w:t xml:space="preserve">Unlimited</w:t>
             </w:r>
           </w:p>
         </w:tc>
@@ -17648,7 +17648,7 @@
             </w:pPr>
             <w:r>
               <w:rPr/>
-              <w:t xml:space="preserve">1 Year</w:t>
+              <w:t xml:space="preserve">Unlimited</w:t>
             </w:r>
           </w:p>
         </w:tc>
@@ -18616,7 +18616,7 @@
                 <w:b/>
                 <w:bCs/>
               </w:rPr>
-              <w:t xml:space="preserve">CoCo Starter</w:t>
+              <w:t xml:space="preserve">Salvage Managers</w:t>
             </w:r>
           </w:p>
         </w:tc>
@@ -19139,7 +19139,7 @@
         <w:spacing w:after="60"/>
       </w:pPr>
       <w:r>
-        <w:t xml:space="preserve">Low entry barrier through CoCo — free to join, Success Fee applies on every completed sale.</w:t>
+        <w:t xml:space="preserve">Low entry barrier through Salvage Managers — individual sellers join free; the Success Fee applies on every completed sale.</w:t>
       </w:r>
     </w:p>
     <w:p>

</xml_diff>

<commit_message>
Open selling on Salvage Managers: no seller approval, Lots still approved, suspension still possible (D-131, BR-09)
Co-Authored-By: Claude Opus 5.5 <noreply@anthropic.com>
Claude-Session: https://claude.ai/code/session_01FpdzLt3rHj1WHFMb7vzaqz
</commit_message>
<xml_diff>
--- a/docs/source-documents/ADWITIX_Master.docx
+++ b/docs/source-documents/ADWITIX_Master.docx
@@ -59,7 +59,7 @@
           <w:sz w:val="22"/>
           <w:szCs w:val="22"/>
         </w:rPr>
-        <w:t xml:space="preserve">Status: Master file, v3 (22 Oct 2026, D-130: Salvage Managers is the one CoCo TradeSphereX and is not on the subscription ladder — BR-12, BR-31 to BR-33, BR-66, Sections 6.2, 6.5 and 6.10 and the glossary updated; the General Marketplace is the combined view of all TSXs, not a Tenant). v2: Fully reconciled — supersedes all prior governance drafts, the separately-issued Consolidated Specification, and all standalone Business Model documents (v1.2 through v1.6, now merged into Section 6). This revision resolves six contradictions identified between the original platform rules (Sections 2–3) and the finalized Business Model (Section 6): BR-08, BR-09, BR-31 through BR-34, BR-56, BR-67, BR-12, and PR-06/PR-32 have been rewritten so the Success Fee schedule and Fee Payer Election in Section 6.4 are the single source of truth on pricing and settlement.</w:t>
+        <w:t xml:space="preserve">Status: Master file, v3 (22 Oct 2026, D-130/D-131: open selling on Salvage Managers in BR-09; Salvage Managers is the one CoCo TradeSphereX and is not on the subscription ladder — BR-12, BR-31 to BR-33, BR-66, Sections 6.2, 6.5 and 6.10 and the glossary updated; the General Marketplace is the combined view of all TSXs, not a Tenant). v2: Fully reconciled — supersedes all prior governance drafts, the separately-issued Consolidated Specification, and all standalone Business Model documents (v1.2 through v1.6, now merged into Section 6). This revision resolves six contradictions identified between the original platform rules (Sections 2–3) and the finalized Business Model (Section 6): BR-08, BR-09, BR-31 through BR-34, BR-56, BR-67, BR-12, and PR-06/PR-32 have been rewritten so the Success Fee schedule and Fee Payer Election in Section 6.4 are the single source of truth on pricing and settlement.</w:t>
       </w:r>
     </w:p>
     <w:p>
@@ -2076,7 +2076,7 @@
         <w:t xml:space="preserve">Statement: </w:t>
       </w:r>
       <w:r>
-        <w:t xml:space="preserve">Each whitelisted tenant is administered by exactly one Tenant Admin at a time — a specific person holding a normal buyer/seller account, additionally granted a time-bound admin role by formal agreement between the Super Admin and the tenant's company. The company designates (and may replace) whoever holds this post; it is never self-appointed. The Success Fee is a fixed, platform-wide schedule (Section 6.4) that the Tenant Admin cannot adjust; the Tenant Admin's discretion is limited to Fee Payer Election (Section 6.4, BR-32) on their storefront's Trading Sessions. The Tenant Admin still reviews and approves listings, and holds exclusive authority to upgrade a buyer to a Seller — scoped strictly to that tenant's own storefront. A seller upgraded on one tenant has no automatic selling rights on another. If a seller's account is suspended, all of their active listings on that tenant are instantly suspended pending review.</w:t>
+        <w:t xml:space="preserve">Each whitelisted tenant is administered by exactly one Tenant Admin at a time — a specific person holding a normal buyer/seller account, additionally granted a time-bound admin role by formal agreement between the Super Admin and the tenant's company. The company designates (and may replace) whoever holds this post; it is never self-appointed. The Success Fee is a fixed, platform-wide schedule (Section 6.4) that the Tenant Admin cannot adjust; the Tenant Admin's discretion is limited to Fee Payer Election (Section 6.4, BR-32) on their storefront's Trading Sessions. The Tenant Admin still reviews and approves listings, and holds exclusive authority to upgrade a buyer to a Seller — scoped strictly to that tenant's own storefront. A seller upgraded on one tenant has no automatic selling rights on another. Salvage Managers is the one exception: selling there is open to every KYC-verified user with no seller approval, though each Lot is still reviewed and approved by its Tenant Admin like on any other tenant, and its Tenant Admin may still suspend a seller there. If a seller's account is suspended, all of their active listings on that tenant are instantly suspended pending review.</w:t>
       </w:r>
     </w:p>
     <w:p>

</xml_diff>

<commit_message>
D-143: DB password out of the code (rotated on the server); delete sample tenants; BR-45 photo maximum = plan limit
Database.php's password is now empty: production reads it from the
shared server .env, where the rotation put the new one. Migration 081
removes the two sample tenants (matched by id and name; roles removed,
people kept; skipped if still referenced). Master document v4: BR-45's
maximum is the plan's per-Lot limit (Section 6.5). Diagnose reports the
server's location and a round trip to an Indian host.

Co-Authored-By: Claude Opus 5.5 <noreply@anthropic.com>
Claude-Session: https://claude.ai/code/session_01FpdzLt3rHj1WHFMb7vzaqz
</commit_message>
<xml_diff>
--- a/docs/source-documents/ADWITIX_Master.docx
+++ b/docs/source-documents/ADWITIX_Master.docx
@@ -59,7 +59,7 @@
           <w:sz w:val="22"/>
           <w:szCs w:val="22"/>
         </w:rPr>
-        <w:t xml:space="preserve">Status: Master file, v3 (22 Oct 2026, D-130/D-131: open selling on Salvage Managers in BR-09; Salvage Managers is the one CoCo TradeSphereX and is not on the subscription ladder — BR-12, BR-31 to BR-33, BR-66, Sections 6.2, 6.5 and 6.10 and the glossary updated; the General Marketplace is the combined view of all TSXs, not a Tenant). v2: Fully reconciled — supersedes all prior governance drafts, the separately-issued Consolidated Specification, and all standalone Business Model documents (v1.2 through v1.6, now merged into Section 6). This revision resolves six contradictions identified between the original platform rules (Sections 2–3) and the finalized Business Model (Section 6): BR-08, BR-09, BR-31 through BR-34, BR-56, BR-67, BR-12, and PR-06/PR-32 have been rewritten so the Success Fee schedule and Fee Payer Election in Section 6.4 are the single source of truth on pricing and settlement.</w:t>
+        <w:t xml:space="preserve">Status: Master file, v4 (24 Oct 2026, D-138: BR-45’s photo maximum is the plan’s per-Lot limit in Section 6.5 rather than a fixed 50. v3, 22 Oct 2026, D-130/D-131: open selling on Salvage Managers in BR-09; Salvage Managers is the one CoCo TradeSphereX and is not on the subscription ladder — BR-12, BR-31 to BR-33, BR-66, Sections 6.2, 6.5 and 6.10 and the glossary updated; the General Marketplace is the combined view of all TSXs, not a Tenant). v2: Fully reconciled — supersedes all prior governance drafts, the separately-issued Consolidated Specification, and all standalone Business Model documents (v1.2 through v1.6, now merged into Section 6). This revision resolves six contradictions identified between the original platform rules (Sections 2–3) and the finalized Business Model (Section 6): BR-08, BR-09, BR-31 through BR-34, BR-56, BR-67, BR-12, and PR-06/PR-32 have been rewritten so the Success Fee schedule and Fee Payer Election in Section 6.4 are the single source of truth on pricing and settlement.</w:t>
       </w:r>
     </w:p>
     <w:p>
@@ -5324,7 +5324,7 @@
         <w:t xml:space="preserve">Statement: </w:t>
       </w:r>
       <w:r>
-        <w:t xml:space="preserve">Auto-generated placeholders, stock photography, and default fallbacks are strictly prohibited. Every listing requires a minimum of 5 and maximum of 50 seller-uploaded photographs, with exactly one explicitly designated as the Main Display Photo. All photos are server-side compressed to a 300KB target (WebP format) on upload. Videos are capped at 720p resolution and 120 seconds duration, server-side compressed to a 4 Mbps target bitrate (approximately 59MB per full video). Documents carry a 2MB consolidated limit per listing/submission. Authenticity is verified via structured GPS + timestamp data captured by the app itself at the moment of shooting (not gallery upload, not file EXIF metadata, which can be stripped or spoofed). The original, uncompressed upload is discarded once the compressed, authenticity-tagged version is generated and stored.</w:t>
+        <w:t xml:space="preserve">Auto-generated placeholders, stock photography, and default fallbacks are strictly prohibited. Every listing requires a minimum of 5 seller-uploaded photographs, and no more than the per-Lot photo limit of its TradeSphereX’s subscription plan (Section 6.5), with exactly one explicitly designated as the Main Display Photo. All photos are server-side compressed to a 300KB target (WebP format) on upload. Videos are capped at 720p resolution and 120 seconds duration, server-side compressed to a 4 Mbps target bitrate (approximately 59MB per full video). Documents carry a 2MB consolidated limit per listing/submission. Authenticity is verified via structured GPS + timestamp data captured by the app itself at the moment of shooting (not gallery upload, not file EXIF metadata, which can be stripped or spoofed). The original, uncompressed upload is discarded once the compressed, authenticity-tagged version is generated and stored.</w:t>
       </w:r>
     </w:p>
     <w:p>

</xml_diff>